<commit_message>
procurações: fix 3 bugs template procuracao_sigma
1. Remove SDTs vermelhos (labels descritivos) que apareciam ao lado dos
   campos preenchidos no documento gerado
2. Substitui 'Município/UF' por {{MUNICIPIO_UF}} no corpo (p6 e p20)
3. Substitui 'Clique para inserir uma data' por {{DATA_EXTENSO}} no p20
4. Adiciona _extrair_municipio_uf() em procuracoes.py
5. Adiciona MUNICIPIO_UF em _valores_outorgante()

Co-Authored-By: Claude Sonnet 4.6 <noreply@anthropic.com>
</commit_message>
<xml_diff>
--- a/static/modelos_procuracao/procuracao_sigma.docx
+++ b/static/modelos_procuracao/procuracao_sigma.docx
@@ -80,39 +80,6 @@
         </w:rPr>
         <w:t xml:space="preserve"> {{RAZAO_SOCIAL}}</w:t>
       </w:r>
-      <w:sdt>
-        <w:sdtPr>
-          <w:rPr>
-            <w:rFonts w:ascii="Times New Roman" w:hAnsi="Times New Roman" w:cs="Times New Roman"/>
-          </w:rPr>
-          <w:id w:val="-438221837"/>
-          <w:placeholder>
-            <w:docPart w:val="B3506E50891147FEA3D831952A0CB555"/>
-          </w:placeholder>
-          <w:temporary/>
-          <w:showingPlcHdr/>
-          <w:text/>
-        </w:sdtPr>
-        <w:sdtEndPr>
-          <w:rPr>
-            <w:rFonts w:eastAsia="Times New Roman"/>
-            <w:b/>
-            <w:bCs/>
-            <w:color w:val="000000" w:themeColor="text1"/>
-            <w:shd w:val="clear" w:color="auto" w:fill="FFFFFF"/>
-          </w:rPr>
-        </w:sdtEndPr>
-        <w:sdtContent>
-          <w:r>
-            <w:rPr>
-              <w:rStyle w:val="TextodoEspaoReservado"/>
-              <w:rFonts w:ascii="Times New Roman" w:hAnsi="Times New Roman" w:cs="Times New Roman"/>
-              <w:color w:val="C00000"/>
-            </w:rPr>
-            <w:t>razão social da empresa</w:t>
-          </w:r>
-        </w:sdtContent>
-      </w:sdt>
       <w:r>
         <w:rPr>
           <w:rFonts w:ascii="Times New Roman" w:eastAsia="Times New Roman" w:hAnsi="Times New Roman" w:cs="Times New Roman"/>
@@ -131,33 +98,6 @@
         </w:rPr>
         <w:t xml:space="preserve"> estabelecida no endereço {{ENDERECO}}</w:t>
       </w:r>
-      <w:sdt>
-        <w:sdtPr>
-          <w:rPr>
-            <w:rFonts w:ascii="Times New Roman" w:eastAsia="Times New Roman" w:hAnsi="Times New Roman" w:cs="Times New Roman"/>
-            <w:color w:val="000000" w:themeColor="text1"/>
-            <w:kern w:val="36"/>
-            <w:lang w:eastAsia="pt-BR"/>
-          </w:rPr>
-          <w:id w:val="1700282332"/>
-          <w:placeholder>
-            <w:docPart w:val="B1AE203093A04ED7B6AA8724C3A72FF3"/>
-          </w:placeholder>
-          <w:showingPlcHdr/>
-          <w:text/>
-        </w:sdtPr>
-        <w:sdtEndPr/>
-        <w:sdtContent>
-          <w:r>
-            <w:rPr>
-              <w:rStyle w:val="TextodoEspaoReservado"/>
-              <w:rFonts w:ascii="Times New Roman" w:hAnsi="Times New Roman" w:cs="Times New Roman"/>
-              <w:color w:val="C00000"/>
-            </w:rPr>
-            <w:t>endereço da empresa</w:t>
-          </w:r>
-        </w:sdtContent>
-      </w:sdt>
       <w:r>
         <w:rPr>
           <w:rFonts w:ascii="Times New Roman" w:eastAsia="Times New Roman" w:hAnsi="Times New Roman" w:cs="Times New Roman"/>
@@ -188,34 +128,6 @@
         </w:rPr>
         <w:t xml:space="preserve"> {{CNPJ}}</w:t>
       </w:r>
-      <w:sdt>
-        <w:sdtPr>
-          <w:rPr>
-            <w:rFonts w:ascii="Times New Roman" w:eastAsia="Times New Roman" w:hAnsi="Times New Roman" w:cs="Times New Roman"/>
-            <w:b/>
-            <w:bCs/>
-            <w:color w:val="000000" w:themeColor="text1"/>
-            <w:shd w:val="clear" w:color="auto" w:fill="FFFFFF"/>
-          </w:rPr>
-          <w:id w:val="951823079"/>
-          <w:placeholder>
-            <w:docPart w:val="2471A61DD16941FC9DBDD229FB54707D"/>
-          </w:placeholder>
-          <w:showingPlcHdr/>
-          <w:text/>
-        </w:sdtPr>
-        <w:sdtEndPr/>
-        <w:sdtContent>
-          <w:r>
-            <w:rPr>
-              <w:rStyle w:val="TextodoEspaoReservado"/>
-              <w:rFonts w:ascii="Times New Roman" w:hAnsi="Times New Roman" w:cs="Times New Roman"/>
-              <w:color w:val="C00000"/>
-            </w:rPr>
-            <w:t>número do CNPJ</w:t>
-          </w:r>
-        </w:sdtContent>
-      </w:sdt>
       <w:r>
         <w:rPr>
           <w:rFonts w:ascii="Times New Roman" w:eastAsia="Times New Roman" w:hAnsi="Times New Roman" w:cs="Times New Roman"/>
@@ -235,33 +147,6 @@
         </w:rPr>
         <w:t xml:space="preserve"> {{NOME_REPRESENTANTE}}</w:t>
       </w:r>
-      <w:sdt>
-        <w:sdtPr>
-          <w:rPr>
-            <w:rFonts w:ascii="Times New Roman" w:eastAsia="Times New Roman" w:hAnsi="Times New Roman" w:cs="Times New Roman"/>
-            <w:b/>
-            <w:bCs/>
-            <w:color w:val="000000" w:themeColor="text1"/>
-            <w:shd w:val="clear" w:color="auto" w:fill="FFFFFF"/>
-          </w:rPr>
-          <w:id w:val="-1324728946"/>
-          <w:placeholder>
-            <w:docPart w:val="846167E4EA704AA4BC3FA21B18ACA28C"/>
-          </w:placeholder>
-          <w:showingPlcHdr/>
-        </w:sdtPr>
-        <w:sdtEndPr/>
-        <w:sdtContent>
-          <w:r>
-            <w:rPr>
-              <w:rStyle w:val="TextodoEspaoReservado"/>
-              <w:rFonts w:ascii="Times New Roman" w:hAnsi="Times New Roman" w:cs="Times New Roman"/>
-              <w:color w:val="C00000"/>
-            </w:rPr>
-            <w:t>nome do(a) sócio(a) responsável na RFB</w:t>
-          </w:r>
-        </w:sdtContent>
-      </w:sdt>
       <w:r>
         <w:rPr>
           <w:rFonts w:ascii="Times New Roman" w:eastAsia="Times New Roman" w:hAnsi="Times New Roman" w:cs="Times New Roman"/>
@@ -271,33 +156,6 @@
         </w:rPr>
         <w:t>, {{ESTADO_CIVIL}}</w:t>
       </w:r>
-      <w:sdt>
-        <w:sdtPr>
-          <w:rPr>
-            <w:rFonts w:ascii="Times New Roman" w:eastAsia="Times New Roman" w:hAnsi="Times New Roman" w:cs="Times New Roman"/>
-            <w:color w:val="000000" w:themeColor="text1"/>
-            <w:kern w:val="36"/>
-            <w:lang w:eastAsia="pt-BR"/>
-          </w:rPr>
-          <w:id w:val="-1099567228"/>
-          <w:placeholder>
-            <w:docPart w:val="BFD40D2F00B04975904F2B28AD0A2480"/>
-          </w:placeholder>
-          <w:showingPlcHdr/>
-          <w:text/>
-        </w:sdtPr>
-        <w:sdtEndPr/>
-        <w:sdtContent>
-          <w:r>
-            <w:rPr>
-              <w:rStyle w:val="TextodoEspaoReservado"/>
-              <w:rFonts w:ascii="Times New Roman" w:hAnsi="Times New Roman" w:cs="Times New Roman"/>
-              <w:color w:val="C00000"/>
-            </w:rPr>
-            <w:t>nacionalidade</w:t>
-          </w:r>
-        </w:sdtContent>
-      </w:sdt>
       <w:r>
         <w:rPr>
           <w:rFonts w:ascii="Times New Roman" w:eastAsia="Times New Roman" w:hAnsi="Times New Roman" w:cs="Times New Roman"/>
@@ -307,32 +165,6 @@
         </w:rPr>
         <w:t>, {{PROFISSAO}}</w:t>
       </w:r>
-      <w:sdt>
-        <w:sdtPr>
-          <w:rPr>
-            <w:rFonts w:ascii="Times New Roman" w:eastAsia="Times New Roman" w:hAnsi="Times New Roman" w:cs="Times New Roman"/>
-            <w:color w:val="000000" w:themeColor="text1"/>
-            <w:kern w:val="36"/>
-            <w:lang w:eastAsia="pt-BR"/>
-          </w:rPr>
-          <w:id w:val="411741576"/>
-          <w:placeholder>
-            <w:docPart w:val="69599C1356074155ACDA9E6EFBC055C7"/>
-          </w:placeholder>
-          <w:showingPlcHdr/>
-        </w:sdtPr>
-        <w:sdtEndPr/>
-        <w:sdtContent>
-          <w:r>
-            <w:rPr>
-              <w:rStyle w:val="TextodoEspaoReservado"/>
-              <w:rFonts w:ascii="Times New Roman" w:hAnsi="Times New Roman" w:cs="Times New Roman"/>
-              <w:color w:val="C00000"/>
-            </w:rPr>
-            <w:t>estado civil</w:t>
-          </w:r>
-        </w:sdtContent>
-      </w:sdt>
       <w:r>
         <w:rPr>
           <w:rFonts w:ascii="Times New Roman" w:eastAsia="Times New Roman" w:hAnsi="Times New Roman" w:cs="Times New Roman"/>
@@ -342,32 +174,6 @@
         </w:rPr>
         <w:t>, {{RG_REPRESENTANTE}}</w:t>
       </w:r>
-      <w:sdt>
-        <w:sdtPr>
-          <w:rPr>
-            <w:rFonts w:ascii="Times New Roman" w:eastAsia="Times New Roman" w:hAnsi="Times New Roman" w:cs="Times New Roman"/>
-            <w:color w:val="000000" w:themeColor="text1"/>
-            <w:kern w:val="36"/>
-            <w:lang w:eastAsia="pt-BR"/>
-          </w:rPr>
-          <w:id w:val="-1452930832"/>
-          <w:placeholder>
-            <w:docPart w:val="6B412BDF0600482E976BCD29128928DA"/>
-          </w:placeholder>
-          <w:showingPlcHdr/>
-        </w:sdtPr>
-        <w:sdtEndPr/>
-        <w:sdtContent>
-          <w:r>
-            <w:rPr>
-              <w:rStyle w:val="TextodoEspaoReservado"/>
-              <w:rFonts w:ascii="Times New Roman" w:hAnsi="Times New Roman" w:cs="Times New Roman"/>
-              <w:color w:val="C00000"/>
-            </w:rPr>
-            <w:t>profissão</w:t>
-          </w:r>
-        </w:sdtContent>
-      </w:sdt>
       <w:r>
         <w:rPr>
           <w:rFonts w:ascii="Times New Roman" w:eastAsia="Times New Roman" w:hAnsi="Times New Roman" w:cs="Times New Roman"/>
@@ -377,32 +183,6 @@
         </w:rPr>
         <w:t>, residente e domiciliado(a) na {{DOMICILIO_REPRESENTANTE}}</w:t>
       </w:r>
-      <w:sdt>
-        <w:sdtPr>
-          <w:rPr>
-            <w:rFonts w:ascii="Times New Roman" w:eastAsia="Times New Roman" w:hAnsi="Times New Roman" w:cs="Times New Roman"/>
-            <w:color w:val="000000" w:themeColor="text1"/>
-            <w:kern w:val="36"/>
-            <w:lang w:eastAsia="pt-BR"/>
-          </w:rPr>
-          <w:id w:val="-787583537"/>
-          <w:placeholder>
-            <w:docPart w:val="5DB83201180548DF8AE2A20E91A97AAD"/>
-          </w:placeholder>
-          <w:showingPlcHdr/>
-        </w:sdtPr>
-        <w:sdtEndPr/>
-        <w:sdtContent>
-          <w:r>
-            <w:rPr>
-              <w:rStyle w:val="TextodoEspaoReservado"/>
-              <w:rFonts w:ascii="Times New Roman" w:hAnsi="Times New Roman" w:cs="Times New Roman"/>
-              <w:color w:val="C00000"/>
-            </w:rPr>
-            <w:t>endereço residencial do responsável</w:t>
-          </w:r>
-        </w:sdtContent>
-      </w:sdt>
       <w:r>
         <w:rPr>
           <w:rFonts w:ascii="Times New Roman" w:eastAsia="Times New Roman" w:hAnsi="Times New Roman" w:cs="Times New Roman"/>
@@ -432,32 +212,6 @@
         </w:rPr>
         <w:t xml:space="preserve"> {{CPF_REPRESENTANTE}}</w:t>
       </w:r>
-      <w:sdt>
-        <w:sdtPr>
-          <w:rPr>
-            <w:rFonts w:ascii="Times New Roman" w:eastAsia="Times New Roman" w:hAnsi="Times New Roman" w:cs="Times New Roman"/>
-            <w:b/>
-            <w:bCs/>
-            <w:color w:val="000000" w:themeColor="text1"/>
-          </w:rPr>
-          <w:id w:val="141931141"/>
-          <w:placeholder>
-            <w:docPart w:val="601CA30A02454078BDDC0B0AD8B66E6B"/>
-          </w:placeholder>
-          <w:showingPlcHdr/>
-        </w:sdtPr>
-        <w:sdtEndPr/>
-        <w:sdtContent>
-          <w:r>
-            <w:rPr>
-              <w:rStyle w:val="TextodoEspaoReservado"/>
-              <w:rFonts w:ascii="Times New Roman" w:hAnsi="Times New Roman" w:cs="Times New Roman"/>
-              <w:color w:val="C00000"/>
-            </w:rPr>
-            <w:t>número do CPF</w:t>
-          </w:r>
-        </w:sdtContent>
-      </w:sdt>
       <w:r>
         <w:rPr>
           <w:rFonts w:ascii="Times New Roman" w:eastAsia="Times New Roman" w:hAnsi="Times New Roman" w:cs="Times New Roman"/>
@@ -657,36 +411,17 @@
         </w:rPr>
         <w:t xml:space="preserve">referentes aos procedimentos abaixo relacionados, nos seguintes órgãos públicos: Junta Comercial do Estado, Receita Federal do Brasil, Secretaria da Economia do Estado de </w:t>
       </w:r>
-      <w:sdt>
-        <w:sdtPr>
-          <w:rPr>
-            <w:rFonts w:ascii="Times New Roman" w:eastAsia="Times New Roman" w:hAnsi="Times New Roman" w:cs="Times New Roman"/>
-            <w:color w:val="000000" w:themeColor="text1"/>
-            <w:kern w:val="36"/>
-            <w:sz w:val="20"/>
-            <w:szCs w:val="20"/>
-            <w:lang w:eastAsia="pt-BR"/>
-          </w:rPr>
-          <w:id w:val="-150606200"/>
-          <w:placeholder>
-            <w:docPart w:val="6902F0D91DEC4277A482395891DD5EB2"/>
-          </w:placeholder>
-        </w:sdtPr>
-        <w:sdtEndPr/>
-        <w:sdtContent>
-          <w:r>
-            <w:rPr>
-              <w:rFonts w:ascii="Times New Roman" w:eastAsia="Times New Roman" w:hAnsi="Times New Roman" w:cs="Times New Roman"/>
-              <w:color w:val="000000" w:themeColor="text1"/>
-              <w:kern w:val="36"/>
-              <w:sz w:val="20"/>
-              <w:szCs w:val="20"/>
-              <w:lang w:eastAsia="pt-BR"/>
-            </w:rPr>
-            <w:t>Goiás</w:t>
-          </w:r>
-        </w:sdtContent>
-      </w:sdt>
+      <w:r>
+        <w:rPr>
+          <w:rFonts w:ascii="Times New Roman" w:eastAsia="Times New Roman" w:hAnsi="Times New Roman" w:cs="Times New Roman"/>
+          <w:color w:val="000000" w:themeColor="text1"/>
+          <w:kern w:val="36"/>
+          <w:sz w:val="20"/>
+          <w:szCs w:val="20"/>
+          <w:lang w:eastAsia="pt-BR"/>
+        </w:rPr>
+        <w:t>Goiás</w:t>
+      </w:r>
       <w:r>
         <w:rPr>
           <w:rFonts w:ascii="Times New Roman" w:eastAsia="Times New Roman" w:hAnsi="Times New Roman" w:cs="Times New Roman"/>
@@ -720,31 +455,14 @@
         </w:rPr>
         <w:t xml:space="preserve">pal de </w:t>
       </w:r>
-      <w:sdt>
-        <w:sdtPr>
-          <w:rPr>
-            <w:rFonts w:ascii="Times New Roman" w:eastAsia="Times New Roman" w:hAnsi="Times New Roman" w:cs="Times New Roman"/>
-            <w:color w:val="000000" w:themeColor="text1"/>
-            <w:lang w:eastAsia="pt-BR"/>
-          </w:rPr>
-          <w:id w:val="1967699813"/>
-          <w:placeholder>
-            <w:docPart w:val="4EF729610E9C4BEAAEB44DFFC0143445"/>
-          </w:placeholder>
-          <w:showingPlcHdr/>
-        </w:sdtPr>
-        <w:sdtEndPr/>
-        <w:sdtContent>
-          <w:r>
-            <w:rPr>
-              <w:rStyle w:val="TextodoEspaoReservado"/>
-              <w:rFonts w:ascii="Times New Roman" w:hAnsi="Times New Roman" w:cs="Times New Roman"/>
-              <w:color w:val="C00000"/>
-            </w:rPr>
-            <w:t>Município/UF</w:t>
-          </w:r>
-        </w:sdtContent>
-      </w:sdt>
+      <w:r>
+        <w:rPr>
+          <w:rFonts w:ascii="Times New Roman" w:hAnsi="Times New Roman" w:cs="Times New Roman"/>
+          <w:sz w:val="20"/>
+          <w:szCs w:val="20"/>
+        </w:rPr>
+        <w:t xml:space="preserve">{{MUNICIPIO_UF}}</w:t>
+      </w:r>
       <w:r>
         <w:rPr>
           <w:rFonts w:ascii="Times New Roman" w:eastAsia="Times New Roman" w:hAnsi="Times New Roman" w:cs="Times New Roman"/>
@@ -1698,119 +1416,46 @@
           <w:lang w:eastAsia="pt-BR"/>
         </w:rPr>
       </w:pPr>
-      <w:sdt>
-        <w:sdtPr>
-          <w:rPr>
-            <w:rFonts w:ascii="Times New Roman" w:eastAsia="Times New Roman" w:hAnsi="Times New Roman" w:cs="Times New Roman"/>
-            <w:color w:val="000000" w:themeColor="text1"/>
-            <w:sz w:val="20"/>
-            <w:szCs w:val="20"/>
-            <w:lang w:eastAsia="pt-BR"/>
-          </w:rPr>
-          <w:id w:val="-1786570808"/>
-          <w:placeholder>
-            <w:docPart w:val="703C23771AAF48AC9D0E31EC930B1E59"/>
-          </w:placeholder>
-        </w:sdtPr>
-        <w:sdtEndPr/>
-        <w:sdtContent>
-          <w:sdt>
-            <w:sdtPr>
-              <w:rPr>
-                <w:rFonts w:ascii="Times New Roman" w:eastAsia="Times New Roman" w:hAnsi="Times New Roman" w:cs="Times New Roman"/>
-                <w:color w:val="000000" w:themeColor="text1"/>
-                <w:lang w:eastAsia="pt-BR"/>
-              </w:rPr>
-              <w:id w:val="-421258725"/>
-              <w:placeholder>
-                <w:docPart w:val="8FBA1C41DE8A4CF69282E39689285F4F"/>
-              </w:placeholder>
-              <w:showingPlcHdr/>
-            </w:sdtPr>
-            <w:sdtEndPr/>
-            <w:sdtContent>
-              <w:r>
-                <w:rPr>
-                  <w:rStyle w:val="TextodoEspaoReservado"/>
-                  <w:rFonts w:ascii="Times New Roman" w:hAnsi="Times New Roman" w:cs="Times New Roman"/>
-                  <w:color w:val="C00000"/>
-                </w:rPr>
-                <w:t>Município/UF</w:t>
-              </w:r>
-            </w:sdtContent>
-          </w:sdt>
-          <w:r>
-            <w:rPr>
-              <w:rFonts w:ascii="Times New Roman" w:eastAsia="Times New Roman" w:hAnsi="Times New Roman" w:cs="Times New Roman"/>
-              <w:color w:val="000000" w:themeColor="text1"/>
-              <w:lang w:eastAsia="pt-BR"/>
-            </w:rPr>
-            <w:t xml:space="preserve">, </w:t>
-          </w:r>
-          <w:sdt>
-            <w:sdtPr>
-              <w:rPr>
-                <w:rFonts w:ascii="Times New Roman" w:eastAsia="Times New Roman" w:hAnsi="Times New Roman" w:cs="Times New Roman"/>
-                <w:color w:val="000000" w:themeColor="text1"/>
-                <w:lang w:eastAsia="pt-BR"/>
-              </w:rPr>
-              <w:id w:val="-1824196597"/>
-              <w:placeholder>
-                <w:docPart w:val="EDB8BCFECBAC446986B7A552ED5FEDB6"/>
-              </w:placeholder>
-            </w:sdtPr>
-            <w:sdtEndPr/>
-            <w:sdtContent>
-              <w:sdt>
-                <w:sdtPr>
-                  <w:rPr>
-                    <w:rFonts w:ascii="Times New Roman" w:eastAsia="Times New Roman" w:hAnsi="Times New Roman" w:cs="Times New Roman"/>
-                    <w:color w:val="000000" w:themeColor="text1"/>
-                    <w:lang w:eastAsia="pt-BR"/>
-                  </w:rPr>
-                  <w:id w:val="-142583094"/>
-                  <w:placeholder>
-                    <w:docPart w:val="F6A8DDE4D21E4A9DA58DADD212BFEAB4"/>
-                  </w:placeholder>
-                  <w:showingPlcHdr/>
-                  <w:date>
-                    <w:dateFormat w:val="dd/MM/yyyy"/>
-                    <w:lid w:val="pt-BR"/>
-                    <w:storeMappedDataAs w:val="dateTime"/>
-                    <w:calendar w:val="gregorian"/>
-                  </w:date>
-                </w:sdtPr>
-                <w:sdtEndPr/>
-                <w:sdtContent>
-                  <w:r>
-                    <w:rPr>
-                      <w:rStyle w:val="TextodoEspaoReservado"/>
-                      <w:color w:val="C00000"/>
-                    </w:rPr>
-                    <w:t>Clique para inserir uma data</w:t>
-                  </w:r>
-                </w:sdtContent>
-              </w:sdt>
-            </w:sdtContent>
-          </w:sdt>
-          <w:r>
-            <w:rPr>
-              <w:rFonts w:ascii="Times New Roman" w:eastAsia="Times New Roman" w:hAnsi="Times New Roman" w:cs="Times New Roman"/>
-              <w:color w:val="000000" w:themeColor="text1"/>
-              <w:lang w:eastAsia="pt-BR"/>
-            </w:rPr>
-            <w:t>.</w:t>
-          </w:r>
-          <w:r>
-            <w:rPr>
-              <w:rFonts w:ascii="Times New Roman" w:eastAsia="Times New Roman" w:hAnsi="Times New Roman" w:cs="Times New Roman"/>
-              <w:color w:val="000000" w:themeColor="text1"/>
-              <w:lang w:eastAsia="pt-BR"/>
-            </w:rPr>
-            <w:t xml:space="preserve"> </w:t>
-          </w:r>
-        </w:sdtContent>
-      </w:sdt>
+      <w:r>
+        <w:rPr>
+          <w:rFonts w:ascii="Times New Roman" w:hAnsi="Times New Roman" w:cs="Times New Roman"/>
+          <w:sz w:val="20"/>
+          <w:szCs w:val="20"/>
+        </w:rPr>
+        <w:t xml:space="preserve">{{MUNICIPIO_UF}}</w:t>
+      </w:r>
+      <w:r>
+        <w:rPr>
+          <w:rFonts w:ascii="Times New Roman" w:eastAsia="Times New Roman" w:hAnsi="Times New Roman" w:cs="Times New Roman"/>
+          <w:color w:val="000000" w:themeColor="text1"/>
+          <w:lang w:eastAsia="pt-BR"/>
+        </w:rPr>
+        <w:t xml:space="preserve">, </w:t>
+      </w:r>
+      <w:r>
+        <w:rPr>
+          <w:rFonts w:ascii="Times New Roman" w:hAnsi="Times New Roman" w:cs="Times New Roman"/>
+          <w:sz w:val="20"/>
+          <w:szCs w:val="20"/>
+        </w:rPr>
+        <w:t xml:space="preserve">{{DATA_EXTENSO}}</w:t>
+      </w:r>
+      <w:r>
+        <w:rPr>
+          <w:rFonts w:ascii="Times New Roman" w:eastAsia="Times New Roman" w:hAnsi="Times New Roman" w:cs="Times New Roman"/>
+          <w:color w:val="000000" w:themeColor="text1"/>
+          <w:lang w:eastAsia="pt-BR"/>
+        </w:rPr>
+        <w:t>.</w:t>
+      </w:r>
+      <w:r>
+        <w:rPr>
+          <w:rFonts w:ascii="Times New Roman" w:eastAsia="Times New Roman" w:hAnsi="Times New Roman" w:cs="Times New Roman"/>
+          <w:color w:val="000000" w:themeColor="text1"/>
+          <w:lang w:eastAsia="pt-BR"/>
+        </w:rPr>
+        <w:t xml:space="preserve"> </w:t>
+      </w:r>
       <w:r>
         <w:rPr>
           <w:rFonts w:ascii="Times New Roman" w:eastAsia="Times New Roman" w:hAnsi="Times New Roman" w:cs="Times New Roman"/>

</xml_diff>